<commit_message>
Simplifica seção de dados fictícios
</commit_message>
<xml_diff>
--- a/Desafio Técnico.docx
+++ b/Desafio Técnico.docx
@@ -4651,285 +4651,58 @@
       </w:r>
     </w:p>
     <w:p>
-      <w:pPr>
-        <w:spacing w:after="120"/>
-      </w:pPr>
-      <w:r>
-        <w:t xml:space="preserve">A modelagem das tabelas, os relacionamentos e a geração dos valores (dotações, empenhos, inconsistências propositais etc.) continuam sendo responsabilidade sua — e fazem parte da avaliação.</w:t>
-      </w:r>
-    </w:p>
-    <w:p>
-      <w:pPr>
-        <w:spacing w:after="120"/>
-      </w:pPr>
-      <w:r>
-        <w:t xml:space="preserve">A aplicação deverá conter aproximadamente:</w:t>
-      </w:r>
-    </w:p>
-    <w:p>
-      <w:pPr>
-        <w:pStyle w:val="Heading2"/>
-      </w:pPr>
-      <w:r>
-        <w:t xml:space="preserve">Órgãos</w:t>
-      </w:r>
-    </w:p>
-    <w:p>
-      <w:pPr>
-        <w:spacing w:after="120"/>
-      </w:pPr>
-      <w:r>
-        <w:t xml:space="preserve">20 órgãos estaduais</w:t>
-      </w:r>
-    </w:p>
-    <w:p>
-      <w:pPr>
-        <w:spacing w:after="120"/>
-      </w:pPr>
-      <w:r>
-        <w:t xml:space="preserve">Campos sugeridos: </w:t>
-      </w:r>
-      <w:r>
-        <w:rPr>
-          <w:rFonts w:ascii="Consolas" w:cs="Consolas" w:eastAsia="Consolas" w:hAnsi="Consolas"/>
-          <w:color w:val="C7254E"/>
-          <w:sz w:val="20"/>
-          <w:szCs w:val="20"/>
-        </w:rPr>
-        <w:t xml:space="preserve">id</w:t>
-      </w:r>
-      <w:r>
-        <w:t xml:space="preserve">, </w:t>
-      </w:r>
-      <w:r>
-        <w:rPr>
-          <w:rFonts w:ascii="Consolas" w:cs="Consolas" w:eastAsia="Consolas" w:hAnsi="Consolas"/>
-          <w:color w:val="C7254E"/>
-          <w:sz w:val="20"/>
-          <w:szCs w:val="20"/>
-        </w:rPr>
-        <w:t xml:space="preserve">sigla</w:t>
-      </w:r>
-      <w:r>
-        <w:t xml:space="preserve">, </w:t>
-      </w:r>
-      <w:r>
-        <w:rPr>
-          <w:rFonts w:ascii="Consolas" w:cs="Consolas" w:eastAsia="Consolas" w:hAnsi="Consolas"/>
-          <w:color w:val="C7254E"/>
-          <w:sz w:val="20"/>
-          <w:szCs w:val="20"/>
-        </w:rPr>
-        <w:t xml:space="preserve">nome</w:t>
-      </w:r>
-      <w:r>
-        <w:t xml:space="preserve">, </w:t>
-      </w:r>
-      <w:r>
-        <w:rPr>
-          <w:rFonts w:ascii="Consolas" w:cs="Consolas" w:eastAsia="Consolas" w:hAnsi="Consolas"/>
-          <w:color w:val="C7254E"/>
-          <w:sz w:val="20"/>
-          <w:szCs w:val="20"/>
-        </w:rPr>
-        <w:t xml:space="preserve">status</w:t>
-      </w:r>
-      <w:r>
-        <w:t xml:space="preserve"> (</w:t>
-      </w:r>
-      <w:r>
-        <w:rPr>
-          <w:rFonts w:ascii="Consolas" w:cs="Consolas" w:eastAsia="Consolas" w:hAnsi="Consolas"/>
-          <w:color w:val="C7254E"/>
-          <w:sz w:val="20"/>
-          <w:szCs w:val="20"/>
-        </w:rPr>
-        <w:t xml:space="preserve">ativo</w:t>
-      </w:r>
-      <w:r>
-        <w:t xml:space="preserve"> ou </w:t>
-      </w:r>
-      <w:r>
-        <w:rPr>
-          <w:rFonts w:ascii="Consolas" w:cs="Consolas" w:eastAsia="Consolas" w:hAnsi="Consolas"/>
-          <w:color w:val="C7254E"/>
-          <w:sz w:val="20"/>
-          <w:szCs w:val="20"/>
-        </w:rPr>
-        <w:t xml:space="preserve">inativo</w:t>
-      </w:r>
-      <w:r>
-        <w:t xml:space="preserve">). Inclua pelo menos um órgão inativo e um órgão sem orçamento.</w:t>
-      </w:r>
-    </w:p>
-    <w:p>
-      <w:pPr>
-        <w:spacing w:after="120"/>
-      </w:pPr>
-      <w:r>
-        <w:t xml:space="preserve">Exemplos</w:t>
-      </w:r>
-    </w:p>
-    <w:p>
-      <w:pPr>
-        <w:pStyle w:val="ListParagraph"/>
-        <w:numPr>
-          <w:ilvl w:val="0"/>
-          <w:numId w:val="2"/>
-        </w:numPr>
-        <w:spacing w:after="60"/>
-      </w:pPr>
-      <w:r>
-        <w:t xml:space="preserve">Casa Civil</w:t>
-      </w:r>
-    </w:p>
-    <w:p>
-      <w:pPr>
-        <w:pStyle w:val="ListParagraph"/>
-        <w:numPr>
-          <w:ilvl w:val="0"/>
-          <w:numId w:val="2"/>
-        </w:numPr>
-        <w:spacing w:after="60"/>
-      </w:pPr>
-      <w:r>
-        <w:t xml:space="preserve">SEPLAG</w:t>
-      </w:r>
-    </w:p>
-    <w:p>
-      <w:pPr>
-        <w:pStyle w:val="ListParagraph"/>
-        <w:numPr>
-          <w:ilvl w:val="0"/>
-          <w:numId w:val="2"/>
-        </w:numPr>
-        <w:spacing w:after="60"/>
-      </w:pPr>
-      <w:r>
-        <w:t xml:space="preserve">DER-RJ</w:t>
-      </w:r>
-    </w:p>
-    <w:p>
-      <w:pPr>
-        <w:pStyle w:val="ListParagraph"/>
-        <w:numPr>
-          <w:ilvl w:val="0"/>
-          <w:numId w:val="2"/>
-        </w:numPr>
-        <w:spacing w:after="60"/>
-      </w:pPr>
-      <w:r>
-        <w:t xml:space="preserve">SEEDUC</w:t>
-      </w:r>
-    </w:p>
-    <w:p>
-      <w:pPr>
-        <w:pStyle w:val="ListParagraph"/>
-        <w:numPr>
-          <w:ilvl w:val="0"/>
-          <w:numId w:val="2"/>
-        </w:numPr>
-        <w:spacing w:after="60"/>
-      </w:pPr>
-      <w:r>
-        <w:t xml:space="preserve">SES</w:t>
-      </w:r>
-    </w:p>
-    <w:p>
-      <w:pPr>
-        <w:pStyle w:val="ListParagraph"/>
-        <w:numPr>
-          <w:ilvl w:val="0"/>
-          <w:numId w:val="2"/>
-        </w:numPr>
-        <w:spacing w:after="60"/>
-      </w:pPr>
-      <w:r>
-        <w:t xml:space="preserve">Polícia Civil</w:t>
-      </w:r>
-    </w:p>
-    <w:p>
-      <w:pPr>
-        <w:pStyle w:val="ListParagraph"/>
-        <w:numPr>
-          <w:ilvl w:val="0"/>
-          <w:numId w:val="2"/>
-        </w:numPr>
-        <w:spacing w:after="60"/>
-      </w:pPr>
-      <w:r>
-        <w:t xml:space="preserve">Polícia Militar</w:t>
-      </w:r>
-    </w:p>
-    <w:p>
-      <w:pPr>
-        <w:pStyle w:val="ListParagraph"/>
-        <w:numPr>
-          <w:ilvl w:val="0"/>
-          <w:numId w:val="2"/>
-        </w:numPr>
-        <w:spacing w:after="60"/>
-      </w:pPr>
-      <w:r>
-        <w:t xml:space="preserve">FAETEC</w:t>
-      </w:r>
-    </w:p>
-    <w:p>
-      <w:pPr>
-        <w:pStyle w:val="ListParagraph"/>
-        <w:numPr>
-          <w:ilvl w:val="0"/>
-          <w:numId w:val="2"/>
-        </w:numPr>
-        <w:spacing w:after="60"/>
-      </w:pPr>
-      <w:r>
-        <w:t xml:space="preserve">DETRAN</w:t>
-      </w:r>
-    </w:p>
-    <w:p>
-      <w:pPr>
-        <w:pStyle w:val="ListParagraph"/>
-        <w:numPr>
-          <w:ilvl w:val="0"/>
-          <w:numId w:val="2"/>
-        </w:numPr>
-        <w:spacing w:after="60"/>
-      </w:pPr>
-      <w:r>
-        <w:t xml:space="preserve">EMOP</w:t>
-      </w:r>
-    </w:p>
-    <w:p>
-      <w:pPr>
-        <w:pStyle w:val="Heading2"/>
-      </w:pPr>
-      <w:r>
-        <w:t xml:space="preserve">Orçamentos</w:t>
-      </w:r>
-    </w:p>
-    <w:p>
-      <w:pPr>
-        <w:spacing w:after="120"/>
-      </w:pPr>
-      <w:r>
-        <w:t xml:space="preserve">500 registros.</w:t>
-      </w:r>
-    </w:p>
-    <w:p>
-      <w:pPr>
-        <w:spacing w:after="120"/>
-      </w:pPr>
-      <w:r>
-        <w:t xml:space="preserve">Cada registro orçamentário deve representar uma combinação de ano, órgão, unidade gestora, programa, ação, natureza da despesa e fonte de recurso.</w:t>
-      </w:r>
-    </w:p>
-    <w:p>
-      <w:pPr>
-        <w:spacing w:after="120"/>
-      </w:pPr>
-      <w:r>
-        <w:t xml:space="preserve">Campos sugeridos:</w:t>
+      <w:r>
+        <w:t>A aplicação deverá gerar automaticamente uma base fictícia com aproximadamente:</w:t>
+      </w:r>
+    </w:p>
+    <w:p>
+      <w:pPr>
+        <w:pStyle w:val="ListParagraph"/>
+      </w:pPr>
+      <w:r>
+        <w:t>20 órgãos estaduais;</w:t>
+      </w:r>
+    </w:p>
+    <w:p>
+      <w:pPr>
+        <w:pStyle w:val="ListParagraph"/>
+      </w:pPr>
+      <w:r>
+        <w:t>500 registros orçamentários;</w:t>
+      </w:r>
+    </w:p>
+    <w:p>
+      <w:pPr>
+        <w:pStyle w:val="ListParagraph"/>
+      </w:pPr>
+      <w:r>
+        <w:t>300 contratos;</w:t>
+      </w:r>
+    </w:p>
+    <w:p>
+      <w:pPr>
+        <w:pStyle w:val="ListParagraph"/>
+      </w:pPr>
+      <w:r>
+        <w:t>30 programas governamentais;</w:t>
+      </w:r>
+    </w:p>
+    <w:p>
+      <w:pPr>
+        <w:pStyle w:val="ListParagraph"/>
+      </w:pPr>
+      <w:r>
+        <w:t>80 ações orçamentárias.</w:t>
+      </w:r>
+    </w:p>
+    <w:p>
+      <w:r>
+        <w:t>Os seeders/factories devem usar o dados-referencia.json como apoio para popular nomes, siglas, programas, ações, fornecedores, fontes de recurso e demais referências.</w:t>
+      </w:r>
+    </w:p>
+    <w:p>
+      <w:r>
+        <w:t>Os dados também devem incluir situações comuns em bases reais, como orçamento sem execução, saldo negativo, contrato vencido, orçamento sem contrato, registros revisados e registros com informações ausentes. A aplicação deve tratar esses cenários de forma clara, sem quebrar a interface nem esconder inconsistências.</w:t>
       </w:r>
     </w:p>
     <w:tbl>
@@ -5553,310 +5326,6 @@
         </w:tc>
       </w:tr>
     </w:tbl>
-    <w:p>
-      <w:pPr>
-        <w:spacing w:after="60"/>
-      </w:pPr>
-    </w:p>
-    <w:p>
-      <w:pPr>
-        <w:spacing w:after="120"/>
-      </w:pPr>
-      <w:r>
-        <w:t xml:space="preserve">Regras esperadas para geração dos valores:</w:t>
-      </w:r>
-    </w:p>
-    <w:p>
-      <w:pPr>
-        <w:pStyle w:val="ListParagraph"/>
-        <w:numPr>
-          <w:ilvl w:val="0"/>
-          <w:numId w:val="2"/>
-        </w:numPr>
-        <w:spacing w:after="60"/>
-      </w:pPr>
-      <w:r>
-        <w:rPr>
-          <w:rFonts w:ascii="Consolas" w:cs="Consolas" w:eastAsia="Consolas" w:hAnsi="Consolas"/>
-          <w:color w:val="C7254E"/>
-          <w:sz w:val="20"/>
-          <w:szCs w:val="20"/>
-        </w:rPr>
-        <w:t xml:space="preserve">dotacao_atualizada</w:t>
-      </w:r>
-      <w:r>
-        <w:t xml:space="preserve"> deve ser calculada a partir de </w:t>
-      </w:r>
-      <w:r>
-        <w:rPr>
-          <w:rFonts w:ascii="Consolas" w:cs="Consolas" w:eastAsia="Consolas" w:hAnsi="Consolas"/>
-          <w:color w:val="C7254E"/>
-          <w:sz w:val="20"/>
-          <w:szCs w:val="20"/>
-        </w:rPr>
-        <w:t xml:space="preserve">dotacao_inicial</w:t>
-      </w:r>
-      <w:r>
-        <w:t xml:space="preserve">, </w:t>
-      </w:r>
-      <w:r>
-        <w:rPr>
-          <w:rFonts w:ascii="Consolas" w:cs="Consolas" w:eastAsia="Consolas" w:hAnsi="Consolas"/>
-          <w:color w:val="C7254E"/>
-          <w:sz w:val="20"/>
-          <w:szCs w:val="20"/>
-        </w:rPr>
-        <w:t xml:space="preserve">suplementacoes</w:t>
-      </w:r>
-      <w:r>
-        <w:t xml:space="preserve"> e </w:t>
-      </w:r>
-      <w:r>
-        <w:rPr>
-          <w:rFonts w:ascii="Consolas" w:cs="Consolas" w:eastAsia="Consolas" w:hAnsi="Consolas"/>
-          <w:color w:val="C7254E"/>
-          <w:sz w:val="20"/>
-          <w:szCs w:val="20"/>
-        </w:rPr>
-        <w:t xml:space="preserve">anulacoes</w:t>
-      </w:r>
-      <w:r>
-        <w:t xml:space="preserve">.</w:t>
-      </w:r>
-    </w:p>
-    <w:p>
-      <w:pPr>
-        <w:pStyle w:val="ListParagraph"/>
-        <w:numPr>
-          <w:ilvl w:val="0"/>
-          <w:numId w:val="2"/>
-        </w:numPr>
-        <w:spacing w:after="60"/>
-      </w:pPr>
-      <w:r>
-        <w:rPr>
-          <w:rFonts w:ascii="Consolas" w:cs="Consolas" w:eastAsia="Consolas" w:hAnsi="Consolas"/>
-          <w:color w:val="C7254E"/>
-          <w:sz w:val="20"/>
-          <w:szCs w:val="20"/>
-        </w:rPr>
-        <w:t xml:space="preserve">saldo</w:t>
-      </w:r>
-      <w:r>
-        <w:t xml:space="preserve"> deve ser calculado preferencialmente a partir de </w:t>
-      </w:r>
-      <w:r>
-        <w:rPr>
-          <w:rFonts w:ascii="Consolas" w:cs="Consolas" w:eastAsia="Consolas" w:hAnsi="Consolas"/>
-          <w:color w:val="C7254E"/>
-          <w:sz w:val="20"/>
-          <w:szCs w:val="20"/>
-        </w:rPr>
-        <w:t xml:space="preserve">dotacao_atualizada - valor_empenhado</w:t>
-      </w:r>
-      <w:r>
-        <w:t xml:space="preserve">.</w:t>
-      </w:r>
-    </w:p>
-    <w:p>
-      <w:pPr>
-        <w:pStyle w:val="ListParagraph"/>
-        <w:numPr>
-          <w:ilvl w:val="0"/>
-          <w:numId w:val="2"/>
-        </w:numPr>
-        <w:spacing w:after="60"/>
-      </w:pPr>
-      <w:r>
-        <w:rPr>
-          <w:rFonts w:ascii="Consolas" w:cs="Consolas" w:eastAsia="Consolas" w:hAnsi="Consolas"/>
-          <w:color w:val="C7254E"/>
-          <w:sz w:val="20"/>
-          <w:szCs w:val="20"/>
-        </w:rPr>
-        <w:t xml:space="preserve">percentual_execucao</w:t>
-      </w:r>
-      <w:r>
-        <w:t xml:space="preserve"> deve representar o percentual empenhado sobre a dotação atualizada.</w:t>
-      </w:r>
-    </w:p>
-    <w:p>
-      <w:pPr>
-        <w:pStyle w:val="ListParagraph"/>
-        <w:numPr>
-          <w:ilvl w:val="0"/>
-          <w:numId w:val="2"/>
-        </w:numPr>
-        <w:spacing w:after="60"/>
-      </w:pPr>
-      <w:r>
-        <w:rPr>
-          <w:rFonts w:ascii="Consolas" w:cs="Consolas" w:eastAsia="Consolas" w:hAnsi="Consolas"/>
-          <w:color w:val="C7254E"/>
-          <w:sz w:val="20"/>
-          <w:szCs w:val="20"/>
-        </w:rPr>
-        <w:t xml:space="preserve">status</w:t>
-      </w:r>
-      <w:r>
-        <w:t xml:space="preserve"> pode indicar situações como:</w:t>
-      </w:r>
-    </w:p>
-    <w:p>
-      <w:pPr>
-        <w:pStyle w:val="ListParagraph"/>
-        <w:numPr>
-          <w:ilvl w:val="1"/>
-          <w:numId w:val="2"/>
-        </w:numPr>
-        <w:spacing w:after="60"/>
-      </w:pPr>
-      <w:r>
-        <w:rPr>
-          <w:rFonts w:ascii="Consolas" w:cs="Consolas" w:eastAsia="Consolas" w:hAnsi="Consolas"/>
-          <w:color w:val="C7254E"/>
-          <w:sz w:val="20"/>
-          <w:szCs w:val="20"/>
-        </w:rPr>
-        <w:t xml:space="preserve">sem_execucao</w:t>
-      </w:r>
-      <w:r>
-        <w:t xml:space="preserve"> — nenhum valor empenhado;</w:t>
-      </w:r>
-    </w:p>
-    <w:p>
-      <w:pPr>
-        <w:pStyle w:val="ListParagraph"/>
-        <w:numPr>
-          <w:ilvl w:val="1"/>
-          <w:numId w:val="2"/>
-        </w:numPr>
-        <w:spacing w:after="60"/>
-      </w:pPr>
-      <w:r>
-        <w:rPr>
-          <w:rFonts w:ascii="Consolas" w:cs="Consolas" w:eastAsia="Consolas" w:hAnsi="Consolas"/>
-          <w:color w:val="C7254E"/>
-          <w:sz w:val="20"/>
-          <w:szCs w:val="20"/>
-        </w:rPr>
-        <w:t xml:space="preserve">em_execucao</w:t>
-      </w:r>
-      <w:r>
-        <w:t xml:space="preserve"> — parte da dotação empenhada;</w:t>
-      </w:r>
-    </w:p>
-    <w:p>
-      <w:pPr>
-        <w:pStyle w:val="ListParagraph"/>
-        <w:numPr>
-          <w:ilvl w:val="1"/>
-          <w:numId w:val="2"/>
-        </w:numPr>
-        <w:spacing w:after="60"/>
-      </w:pPr>
-      <w:r>
-        <w:rPr>
-          <w:rFonts w:ascii="Consolas" w:cs="Consolas" w:eastAsia="Consolas" w:hAnsi="Consolas"/>
-          <w:color w:val="C7254E"/>
-          <w:sz w:val="20"/>
-          <w:szCs w:val="20"/>
-        </w:rPr>
-        <w:t xml:space="preserve">executado</w:t>
-      </w:r>
-      <w:r>
-        <w:t xml:space="preserve"> — dotação totalmente (ou quase totalmente) empenhada;</w:t>
-      </w:r>
-    </w:p>
-    <w:p>
-      <w:pPr>
-        <w:pStyle w:val="ListParagraph"/>
-        <w:numPr>
-          <w:ilvl w:val="1"/>
-          <w:numId w:val="2"/>
-        </w:numPr>
-        <w:spacing w:after="60"/>
-      </w:pPr>
-      <w:r>
-        <w:rPr>
-          <w:rFonts w:ascii="Consolas" w:cs="Consolas" w:eastAsia="Consolas" w:hAnsi="Consolas"/>
-          <w:color w:val="C7254E"/>
-          <w:sz w:val="20"/>
-          <w:szCs w:val="20"/>
-        </w:rPr>
-        <w:t xml:space="preserve">saldo_negativo</w:t>
-      </w:r>
-      <w:r>
-        <w:t xml:space="preserve"> — empenhado acima da dotação atualizada;</w:t>
-      </w:r>
-    </w:p>
-    <w:p>
-      <w:pPr>
-        <w:pStyle w:val="ListParagraph"/>
-        <w:numPr>
-          <w:ilvl w:val="1"/>
-          <w:numId w:val="2"/>
-        </w:numPr>
-        <w:spacing w:after="60"/>
-      </w:pPr>
-      <w:r>
-        <w:rPr>
-          <w:rFonts w:ascii="Consolas" w:cs="Consolas" w:eastAsia="Consolas" w:hAnsi="Consolas"/>
-          <w:color w:val="C7254E"/>
-          <w:sz w:val="20"/>
-          <w:szCs w:val="20"/>
-        </w:rPr>
-        <w:t xml:space="preserve">inconsistente</w:t>
-      </w:r>
-      <w:r>
-        <w:t xml:space="preserve"> — valores que violam a ordem esperada (ex.: pago maior que liquidado) ou campos essenciais ausentes.</w:t>
-      </w:r>
-    </w:p>
-    <w:p>
-      <w:pPr>
-        <w:pStyle w:val="ListParagraph"/>
-        <w:numPr>
-          <w:ilvl w:val="0"/>
-          <w:numId w:val="2"/>
-        </w:numPr>
-        <w:spacing w:after="60"/>
-      </w:pPr>
-      <w:r>
-        <w:t xml:space="preserve">Alguns registros devem conter valores nulos para testar o tratamento de dados ausentes na interface.</w:t>
-      </w:r>
-    </w:p>
-    <w:p>
-      <w:pPr>
-        <w:pStyle w:val="Heading2"/>
-      </w:pPr>
-      <w:r>
-        <w:t xml:space="preserve">Contratos</w:t>
-      </w:r>
-    </w:p>
-    <w:p>
-      <w:pPr>
-        <w:spacing w:after="120"/>
-      </w:pPr>
-      <w:r>
-        <w:t xml:space="preserve">300 contratos.</w:t>
-      </w:r>
-    </w:p>
-    <w:p>
-      <w:pPr>
-        <w:spacing w:after="120"/>
-      </w:pPr>
-      <w:r>
-        <w:t xml:space="preserve">Cada contrato deve representar uma contratação vinculada a um orçamento, com fornecedor, objeto, valor, período de vigência e situação.</w:t>
-      </w:r>
-    </w:p>
-    <w:p>
-      <w:pPr>
-        <w:spacing w:after="120"/>
-      </w:pPr>
-      <w:r>
-        <w:t xml:space="preserve">Campos:</w:t>
-      </w:r>
-    </w:p>
     <w:tbl>
       <w:tblPr>
         <w:tblW w:type="dxa" w:w="9026"/>
@@ -6088,479 +5557,6 @@
         </w:tc>
       </w:tr>
     </w:tbl>
-    <w:p>
-      <w:pPr>
-        <w:spacing w:after="60"/>
-      </w:pPr>
-    </w:p>
-    <w:p>
-      <w:pPr>
-        <w:spacing w:after="120"/>
-      </w:pPr>
-      <w:r>
-        <w:t xml:space="preserve">Status sugeridos:</w:t>
-      </w:r>
-    </w:p>
-    <w:p>
-      <w:pPr>
-        <w:pStyle w:val="ListParagraph"/>
-        <w:numPr>
-          <w:ilvl w:val="0"/>
-          <w:numId w:val="2"/>
-        </w:numPr>
-        <w:spacing w:after="60"/>
-      </w:pPr>
-      <w:r>
-        <w:rPr>
-          <w:rFonts w:ascii="Consolas" w:cs="Consolas" w:eastAsia="Consolas" w:hAnsi="Consolas"/>
-          <w:color w:val="C7254E"/>
-          <w:sz w:val="20"/>
-          <w:szCs w:val="20"/>
-        </w:rPr>
-        <w:t xml:space="preserve">vigente</w:t>
-      </w:r>
-    </w:p>
-    <w:p>
-      <w:pPr>
-        <w:pStyle w:val="ListParagraph"/>
-        <w:numPr>
-          <w:ilvl w:val="0"/>
-          <w:numId w:val="2"/>
-        </w:numPr>
-        <w:spacing w:after="60"/>
-      </w:pPr>
-      <w:r>
-        <w:rPr>
-          <w:rFonts w:ascii="Consolas" w:cs="Consolas" w:eastAsia="Consolas" w:hAnsi="Consolas"/>
-          <w:color w:val="C7254E"/>
-          <w:sz w:val="20"/>
-          <w:szCs w:val="20"/>
-        </w:rPr>
-        <w:t xml:space="preserve">vencido</w:t>
-      </w:r>
-    </w:p>
-    <w:p>
-      <w:pPr>
-        <w:pStyle w:val="ListParagraph"/>
-        <w:numPr>
-          <w:ilvl w:val="0"/>
-          <w:numId w:val="2"/>
-        </w:numPr>
-        <w:spacing w:after="60"/>
-      </w:pPr>
-      <w:r>
-        <w:rPr>
-          <w:rFonts w:ascii="Consolas" w:cs="Consolas" w:eastAsia="Consolas" w:hAnsi="Consolas"/>
-          <w:color w:val="C7254E"/>
-          <w:sz w:val="20"/>
-          <w:szCs w:val="20"/>
-        </w:rPr>
-        <w:t xml:space="preserve">encerrado</w:t>
-      </w:r>
-    </w:p>
-    <w:p>
-      <w:pPr>
-        <w:pStyle w:val="ListParagraph"/>
-        <w:numPr>
-          <w:ilvl w:val="0"/>
-          <w:numId w:val="2"/>
-        </w:numPr>
-        <w:spacing w:after="60"/>
-      </w:pPr>
-      <w:r>
-        <w:rPr>
-          <w:rFonts w:ascii="Consolas" w:cs="Consolas" w:eastAsia="Consolas" w:hAnsi="Consolas"/>
-          <w:color w:val="C7254E"/>
-          <w:sz w:val="20"/>
-          <w:szCs w:val="20"/>
-        </w:rPr>
-        <w:t xml:space="preserve">suspenso</w:t>
-      </w:r>
-    </w:p>
-    <w:p>
-      <w:pPr>
-        <w:pStyle w:val="Heading2"/>
-      </w:pPr>
-      <w:r>
-        <w:t xml:space="preserve">Programas</w:t>
-      </w:r>
-    </w:p>
-    <w:p>
-      <w:pPr>
-        <w:spacing w:after="120"/>
-      </w:pPr>
-      <w:r>
-        <w:t xml:space="preserve">Gerar aproximadamente:</w:t>
-      </w:r>
-    </w:p>
-    <w:p>
-      <w:pPr>
-        <w:pStyle w:val="ListParagraph"/>
-        <w:numPr>
-          <w:ilvl w:val="0"/>
-          <w:numId w:val="2"/>
-        </w:numPr>
-        <w:spacing w:after="60"/>
-      </w:pPr>
-      <w:r>
-        <w:t xml:space="preserve">30 programas governamentais</w:t>
-      </w:r>
-    </w:p>
-    <w:p>
-      <w:pPr>
-        <w:spacing w:after="120"/>
-      </w:pPr>
-      <w:r>
-        <w:t xml:space="preserve">Exemplos:</w:t>
-      </w:r>
-    </w:p>
-    <w:p>
-      <w:pPr>
-        <w:pStyle w:val="ListParagraph"/>
-        <w:numPr>
-          <w:ilvl w:val="0"/>
-          <w:numId w:val="2"/>
-        </w:numPr>
-        <w:spacing w:after="60"/>
-      </w:pPr>
-      <w:r>
-        <w:t xml:space="preserve">Atenção à saúde</w:t>
-      </w:r>
-    </w:p>
-    <w:p>
-      <w:pPr>
-        <w:pStyle w:val="ListParagraph"/>
-        <w:numPr>
-          <w:ilvl w:val="0"/>
-          <w:numId w:val="2"/>
-        </w:numPr>
-        <w:spacing w:after="60"/>
-      </w:pPr>
-      <w:r>
-        <w:t xml:space="preserve">Educação pública de qualidade</w:t>
-      </w:r>
-    </w:p>
-    <w:p>
-      <w:pPr>
-        <w:pStyle w:val="ListParagraph"/>
-        <w:numPr>
-          <w:ilvl w:val="0"/>
-          <w:numId w:val="2"/>
-        </w:numPr>
-        <w:spacing w:after="60"/>
-      </w:pPr>
-      <w:r>
-        <w:t xml:space="preserve">Segurança cidadã</w:t>
-      </w:r>
-    </w:p>
-    <w:p>
-      <w:pPr>
-        <w:pStyle w:val="ListParagraph"/>
-        <w:numPr>
-          <w:ilvl w:val="0"/>
-          <w:numId w:val="2"/>
-        </w:numPr>
-        <w:spacing w:after="60"/>
-      </w:pPr>
-      <w:r>
-        <w:t xml:space="preserve">Infraestrutura rodoviária</w:t>
-      </w:r>
-    </w:p>
-    <w:p>
-      <w:pPr>
-        <w:pStyle w:val="ListParagraph"/>
-        <w:numPr>
-          <w:ilvl w:val="0"/>
-          <w:numId w:val="2"/>
-        </w:numPr>
-        <w:spacing w:after="60"/>
-      </w:pPr>
-      <w:r>
-        <w:t xml:space="preserve">Modernização da gestão pública</w:t>
-      </w:r>
-    </w:p>
-    <w:p>
-      <w:pPr>
-        <w:pStyle w:val="Heading2"/>
-      </w:pPr>
-      <w:r>
-        <w:t xml:space="preserve">Ações</w:t>
-      </w:r>
-    </w:p>
-    <w:p>
-      <w:pPr>
-        <w:spacing w:after="120"/>
-      </w:pPr>
-      <w:r>
-        <w:t xml:space="preserve">Gerar aproximadamente:</w:t>
-      </w:r>
-    </w:p>
-    <w:p>
-      <w:pPr>
-        <w:pStyle w:val="ListParagraph"/>
-        <w:numPr>
-          <w:ilvl w:val="0"/>
-          <w:numId w:val="2"/>
-        </w:numPr>
-        <w:spacing w:after="60"/>
-      </w:pPr>
-      <w:r>
-        <w:t xml:space="preserve">80 ações orçamentárias</w:t>
-      </w:r>
-    </w:p>
-    <w:p>
-      <w:pPr>
-        <w:spacing w:after="120"/>
-      </w:pPr>
-      <w:r>
-        <w:t xml:space="preserve">Exemplos:</w:t>
-      </w:r>
-    </w:p>
-    <w:p>
-      <w:pPr>
-        <w:pStyle w:val="ListParagraph"/>
-        <w:numPr>
-          <w:ilvl w:val="0"/>
-          <w:numId w:val="2"/>
-        </w:numPr>
-        <w:spacing w:after="60"/>
-      </w:pPr>
-      <w:r>
-        <w:t xml:space="preserve">Manutenção de unidades escolares</w:t>
-      </w:r>
-    </w:p>
-    <w:p>
-      <w:pPr>
-        <w:pStyle w:val="ListParagraph"/>
-        <w:numPr>
-          <w:ilvl w:val="0"/>
-          <w:numId w:val="2"/>
-        </w:numPr>
-        <w:spacing w:after="60"/>
-      </w:pPr>
-      <w:r>
-        <w:t xml:space="preserve">Aquisição de medicamentos</w:t>
-      </w:r>
-    </w:p>
-    <w:p>
-      <w:pPr>
-        <w:pStyle w:val="ListParagraph"/>
-        <w:numPr>
-          <w:ilvl w:val="0"/>
-          <w:numId w:val="2"/>
-        </w:numPr>
-        <w:spacing w:after="60"/>
-      </w:pPr>
-      <w:r>
-        <w:t xml:space="preserve">Reforma de hospitais</w:t>
-      </w:r>
-    </w:p>
-    <w:p>
-      <w:pPr>
-        <w:pStyle w:val="ListParagraph"/>
-        <w:numPr>
-          <w:ilvl w:val="0"/>
-          <w:numId w:val="2"/>
-        </w:numPr>
-        <w:spacing w:after="60"/>
-      </w:pPr>
-      <w:r>
-        <w:t xml:space="preserve">Conservação de rodovias</w:t>
-      </w:r>
-    </w:p>
-    <w:p>
-      <w:pPr>
-        <w:pStyle w:val="ListParagraph"/>
-        <w:numPr>
-          <w:ilvl w:val="0"/>
-          <w:numId w:val="2"/>
-        </w:numPr>
-        <w:spacing w:after="60"/>
-      </w:pPr>
-      <w:r>
-        <w:t xml:space="preserve">Capacitação de servidores</w:t>
-      </w:r>
-    </w:p>
-    <w:p>
-      <w:pPr>
-        <w:pStyle w:val="ListParagraph"/>
-        <w:numPr>
-          <w:ilvl w:val="0"/>
-          <w:numId w:val="2"/>
-        </w:numPr>
-        <w:spacing w:after="60"/>
-      </w:pPr>
-      <w:r>
-        <w:t xml:space="preserve">Modernização de sistemas corporativos</w:t>
-      </w:r>
-    </w:p>
-    <w:p>
-      <w:pPr>
-        <w:pStyle w:val="Heading2"/>
-      </w:pPr>
-      <w:r>
-        <w:t xml:space="preserve">Casos especiais</w:t>
-      </w:r>
-    </w:p>
-    <w:p>
-      <w:pPr>
-        <w:spacing w:after="120"/>
-      </w:pPr>
-      <w:r>
-        <w:t xml:space="preserve">Os dados deverão conter propositalmente situações reais como:</w:t>
-      </w:r>
-    </w:p>
-    <w:p>
-      <w:pPr>
-        <w:pStyle w:val="ListParagraph"/>
-        <w:numPr>
-          <w:ilvl w:val="0"/>
-          <w:numId w:val="2"/>
-        </w:numPr>
-        <w:spacing w:after="60"/>
-      </w:pPr>
-      <w:r>
-        <w:t xml:space="preserve">orçamento totalmente executado;</w:t>
-      </w:r>
-    </w:p>
-    <w:p>
-      <w:pPr>
-        <w:pStyle w:val="ListParagraph"/>
-        <w:numPr>
-          <w:ilvl w:val="0"/>
-          <w:numId w:val="2"/>
-        </w:numPr>
-        <w:spacing w:after="60"/>
-      </w:pPr>
-      <w:r>
-        <w:t xml:space="preserve">orçamento sem nenhum empenho;</w:t>
-      </w:r>
-    </w:p>
-    <w:p>
-      <w:pPr>
-        <w:pStyle w:val="ListParagraph"/>
-        <w:numPr>
-          <w:ilvl w:val="0"/>
-          <w:numId w:val="2"/>
-        </w:numPr>
-        <w:spacing w:after="60"/>
-      </w:pPr>
-      <w:r>
-        <w:t xml:space="preserve">orçamento com saldo negativo;</w:t>
-      </w:r>
-    </w:p>
-    <w:p>
-      <w:pPr>
-        <w:pStyle w:val="ListParagraph"/>
-        <w:numPr>
-          <w:ilvl w:val="0"/>
-          <w:numId w:val="2"/>
-        </w:numPr>
-        <w:spacing w:after="60"/>
-      </w:pPr>
-      <w:r>
-        <w:t xml:space="preserve">contrato vencido;</w:t>
-      </w:r>
-    </w:p>
-    <w:p>
-      <w:pPr>
-        <w:pStyle w:val="ListParagraph"/>
-        <w:numPr>
-          <w:ilvl w:val="0"/>
-          <w:numId w:val="2"/>
-        </w:numPr>
-        <w:spacing w:after="60"/>
-      </w:pPr>
-      <w:r>
-        <w:t xml:space="preserve">contrato encerrado;</w:t>
-      </w:r>
-    </w:p>
-    <w:p>
-      <w:pPr>
-        <w:pStyle w:val="ListParagraph"/>
-        <w:numPr>
-          <w:ilvl w:val="0"/>
-          <w:numId w:val="2"/>
-        </w:numPr>
-        <w:spacing w:after="60"/>
-      </w:pPr>
-      <w:r>
-        <w:t xml:space="preserve">orçamento sem contratos;</w:t>
-      </w:r>
-    </w:p>
-    <w:p>
-      <w:pPr>
-        <w:pStyle w:val="ListParagraph"/>
-        <w:numPr>
-          <w:ilvl w:val="0"/>
-          <w:numId w:val="2"/>
-        </w:numPr>
-        <w:spacing w:after="60"/>
-      </w:pPr>
-      <w:r>
-        <w:t xml:space="preserve">órgão sem orçamento;</w:t>
-      </w:r>
-    </w:p>
-    <w:p>
-      <w:pPr>
-        <w:pStyle w:val="ListParagraph"/>
-        <w:numPr>
-          <w:ilvl w:val="0"/>
-          <w:numId w:val="2"/>
-        </w:numPr>
-        <w:spacing w:after="60"/>
-      </w:pPr>
-      <w:r>
-        <w:t xml:space="preserve">pagamento maior que o liquidado (inconsistência proposital);</w:t>
-      </w:r>
-    </w:p>
-    <w:p>
-      <w:pPr>
-        <w:pStyle w:val="ListParagraph"/>
-        <w:numPr>
-          <w:ilvl w:val="0"/>
-          <w:numId w:val="2"/>
-        </w:numPr>
-        <w:spacing w:after="60"/>
-      </w:pPr>
-      <w:r>
-        <w:t xml:space="preserve">orçamento revisado;</w:t>
-      </w:r>
-    </w:p>
-    <w:p>
-      <w:pPr>
-        <w:pStyle w:val="ListParagraph"/>
-        <w:numPr>
-          <w:ilvl w:val="0"/>
-          <w:numId w:val="2"/>
-        </w:numPr>
-        <w:spacing w:after="60"/>
-      </w:pPr>
-      <w:r>
-        <w:t xml:space="preserve">orçamento ainda não revisado;</w:t>
-      </w:r>
-    </w:p>
-    <w:p>
-      <w:pPr>
-        <w:pStyle w:val="ListParagraph"/>
-        <w:numPr>
-          <w:ilvl w:val="0"/>
-          <w:numId w:val="2"/>
-        </w:numPr>
-        <w:spacing w:after="60"/>
-      </w:pPr>
-      <w:r>
-        <w:t xml:space="preserve">registros com campos nulos.</w:t>
-      </w:r>
-    </w:p>
-    <w:p>
-      <w:pPr>
-        <w:spacing w:after="120"/>
-      </w:pPr>
-      <w:r>
-        <w:t xml:space="preserve">O comportamento da aplicação diante desses cenários faz parte da avaliação.</w:t>
-      </w:r>
-    </w:p>
     <w:p>
       <w:pPr>
         <w:pStyle w:val="Heading1"/>

</xml_diff>

<commit_message>
Atualiza link de entrega
</commit_message>
<xml_diff>
--- a/Desafio Técnico.docx
+++ b/Desafio Técnico.docx
@@ -6240,7 +6240,7 @@
           <w:b/>
           <w:bCs/>
         </w:rPr>
-        <w:t xml:space="preserve">https://subpep.rj.gov.br/entrega-desafio</w:t>
+        <w:t>https://subpep.rj.gov.br/suborc/entrega-desafio/entrega-desafio</w:t>
       </w:r>
       <w:r>
         <w:t xml:space="preserve"> até o fim do prazo.</w:t>
@@ -6266,7 +6266,7 @@
           <w:b/>
           <w:bCs/>
         </w:rPr>
-        <w:t xml:space="preserve">https://subpep.rj.gov.br/entrega-desafio</w:t>
+        <w:t>https://subpep.rj.gov.br/suborc/entrega-desafio/entrega-desafio</w:t>
       </w:r>
       <w:r>
         <w:t xml:space="preserve">. Interpretar requisitos faz parte do trabalho, mas preferimos esclarecer a deixar você travado.</w:t>

</xml_diff>

<commit_message>
Ajusta URL do portal de entrega
</commit_message>
<xml_diff>
--- a/Desafio Técnico.docx
+++ b/Desafio Técnico.docx
@@ -6240,7 +6240,7 @@
           <w:b/>
           <w:bCs/>
         </w:rPr>
-        <w:t>https://subpep.rj.gov.br/suborc/entrega-desafio/entrega-desafio</w:t>
+        <w:t>https://subpep.rj.gov.br/suborc/entrega-desafio/</w:t>
       </w:r>
       <w:r>
         <w:t xml:space="preserve"> até o fim do prazo.</w:t>
@@ -6266,7 +6266,7 @@
           <w:b/>
           <w:bCs/>
         </w:rPr>
-        <w:t>https://subpep.rj.gov.br/suborc/entrega-desafio/entrega-desafio</w:t>
+        <w:t>https://subpep.rj.gov.br/suborc/entrega-desafio/</w:t>
       </w:r>
       <w:r>
         <w:t xml:space="preserve">. Interpretar requisitos faz parte do trabalho, mas preferimos esclarecer a deixar você travado.</w:t>

</xml_diff>